<commit_message>
Remove internal changelog from client-facing proposal — never should have been there
</commit_message>
<xml_diff>
--- a/INFRATEK_Propuesta_VIA-HABITA_2026_v11.docx
+++ b/INFRATEK_Propuesta_VIA-HABITA_2026_v11.docx
@@ -25,12 +25,12 @@
           <wp:inline distB="0" distL="0" distR="0" distT="0">
             <wp:extent cx="1828800" cy="1828800"/>
             <wp:effectExtent b="0" l="0" r="0" t="0"/>
-            <wp:docPr id="2" name="image-BYB9OTSkJi3b4jZWquUna.png"/>
+            <wp:docPr id="2" name="image-VXEF-0pq9aZ19-VyslY7b.png"/>
             <a:graphic>
               <a:graphicData uri="http://schemas.openxmlformats.org/drawingml/2006/picture">
                 <pic:pic>
                   <pic:nvPicPr>
-                    <pic:cNvPr id="2" name="image-BYB9OTSkJi3b4jZWquUna.png" descr="INFRATEK"/>
+                    <pic:cNvPr id="2" name="image-VXEF-0pq9aZ19-VyslY7b.png" descr="INFRATEK"/>
                     <pic:cNvPicPr/>
                   </pic:nvPicPr>
                   <pic:blipFill>
@@ -192,23 +192,6 @@
       <w:r>
         <w:rPr/>
         <w:t xml:space="preserve">Valores referenciales: USD $12,500 ≈ CLP $11.750.000 ≈ 310 UF (1 USD ≈ 940 CLP, 1 UF ≈ 38.000 CLP, abril 2026).</w:t>
-      </w:r>
-    </w:p>
-    <w:p>
-      <w:pPr>
-        <w:ind w:left="284"/>
-        <w:jc w:val="both"/>
-        <w:spacing w:lineRule="auto"/>
-      </w:pPr>
-      <w:r>
-        <w:rPr>
-          <w:b/>
-        </w:rPr>
-        <w:t xml:space="preserve">Cambios en v11 (30 Abr 2026):</w:t>
-      </w:r>
-      <w:r>
-        <w:rPr/>
-        <w:t xml:space="preserve"> ajustes editoriales sobre la v10. El comparativo, los tres escenarios (10 → diagnóstico → 100 usuarios), los 6 perfiles, el §14 Horizonte estratégico, los precios y las fechas confirmadas se mantienen intactos. Esta revisión neutraliza referencias personales y suaviza el lenguaje en las secciones de diagnóstico y argumento.</w:t>
       </w:r>
     </w:p>
     <w:p>

</xml_diff>

<commit_message>
Production-ready: PlanGrid fix, title fix, em dashes purged, changelog removed, full audit
</commit_message>
<xml_diff>
--- a/INFRATEK_Propuesta_VIA-HABITA_2026_v11.docx
+++ b/INFRATEK_Propuesta_VIA-HABITA_2026_v11.docx
@@ -25,12 +25,12 @@
           <wp:inline distB="0" distL="0" distR="0" distT="0">
             <wp:extent cx="1828800" cy="1828800"/>
             <wp:effectExtent b="0" l="0" r="0" t="0"/>
-            <wp:docPr id="2" name="image-VXEF-0pq9aZ19-VyslY7b.png"/>
+            <wp:docPr id="2" name="image-zPB_dTjzPnfClSxrhUjc5.png"/>
             <a:graphic>
               <a:graphicData uri="http://schemas.openxmlformats.org/drawingml/2006/picture">
                 <pic:pic>
                   <pic:nvPicPr>
-                    <pic:cNvPr id="2" name="image-VXEF-0pq9aZ19-VyslY7b.png" descr="INFRATEK"/>
+                    <pic:cNvPr id="2" name="image-zPB_dTjzPnfClSxrhUjc5.png" descr="INFRATEK"/>
                     <pic:cNvPicPr/>
                   </pic:nvPicPr>
                   <pic:blipFill>
@@ -201,7 +201,7 @@
       </w:pPr>
       <w:r>
         <w:rPr/>
-        <w:t xml:space="preserve">PARTE I — IMPLEMENTACIÓN BIM</w:t>
+        <w:t xml:space="preserve">PARTE I: IMPLEMENTACIÓN BIM</w:t>
       </w:r>
     </w:p>
     <w:p>
@@ -254,7 +254,7 @@
       </w:r>
       <w:r>
         <w:rPr/>
-        <w:t xml:space="preserve">: hoy hay 1 cuenta de PlanGrid compartida para ~100 personas que tocan cada proyecto. El trazador — la persona que marca el piso para que se construya — recibe planos impresos que un supervisor leyó por él. Cuando el modelo cambia, el trazador no se entera. La cadena se rompe en el último metro.</w:t>
+        <w:t xml:space="preserve">: hoy hay una sola cuenta compartida de PlanGrid por proyecto. El trazador, la persona que marca el piso para que se construya, recibe planos impresos que un supervisor leyó por él. Cuando el modelo cambia, el trazador no se entera. La cadena se rompe en el último metro.</w:t>
       </w:r>
     </w:p>
     <w:p>
@@ -2900,7 +2900,7 @@
         <w:rPr>
           <w:b/>
         </w:rPr>
-        <w:t xml:space="preserve">Mes 1 — Mayo 2026 · Setup y kickoff.</w:t>
+        <w:t xml:space="preserve">Mes 1 · Mayo 2026 · Setup y kickoff.</w:t>
       </w:r>
       <w:r>
         <w:rPr/>
@@ -2915,7 +2915,7 @@
         <w:rPr>
           <w:b/>
         </w:rPr>
-        <w:t xml:space="preserve">Mes 2 — Junio 2026 · Primera coordinación.</w:t>
+        <w:t xml:space="preserve">Mes 2 · Junio 2026 · Primera coordinación.</w:t>
       </w:r>
       <w:r>
         <w:rPr/>
@@ -2930,7 +2930,7 @@
         <w:rPr>
           <w:b/>
         </w:rPr>
-        <w:t xml:space="preserve">Mes 3 — Julio 2026 · Capacitación.</w:t>
+        <w:t xml:space="preserve">Mes 3 · Julio 2026 · Capacitación.</w:t>
       </w:r>
       <w:r>
         <w:rPr/>
@@ -2945,7 +2945,7 @@
         <w:rPr>
           <w:b/>
         </w:rPr>
-        <w:t xml:space="preserve">Mes 4 — Agosto 2026 · Cierre.</w:t>
+        <w:t xml:space="preserve">Mes 4 · Agosto 2026 · Cierre.</w:t>
       </w:r>
       <w:r>
         <w:rPr/>
@@ -3600,7 +3600,7 @@
       </w:pPr>
       <w:r>
         <w:rPr/>
-        <w:t xml:space="preserve">PARTE II — PLATAFORMA VIA-HABITA</w:t>
+        <w:t xml:space="preserve">PARTE II: PLATAFORMA VIA-HABITA</w:t>
       </w:r>
     </w:p>
     <w:p>
@@ -4388,7 +4388,7 @@
       </w:pPr>
       <w:r>
         <w:rPr/>
-        <w:t xml:space="preserve">PARTE III — INVERSIÓN</w:t>
+        <w:t xml:space="preserve">PARTE III: INVERSIÓN</w:t>
       </w:r>
     </w:p>
     <w:p>
@@ -5086,7 +5086,7 @@
             </w:pPr>
             <w:r>
               <w:rPr/>
-              <w:t xml:space="preserve">H0 — Anticipo</w:t>
+              <w:t xml:space="preserve">H0: Anticipo</w:t>
             </w:r>
           </w:p>
         </w:tc>
@@ -5205,7 +5205,7 @@
             </w:pPr>
             <w:r>
               <w:rPr/>
-              <w:t xml:space="preserve">H1 — Setup</w:t>
+              <w:t xml:space="preserve">H1: Setup</w:t>
             </w:r>
           </w:p>
         </w:tc>
@@ -5324,7 +5324,7 @@
             </w:pPr>
             <w:r>
               <w:rPr/>
-              <w:t xml:space="preserve">H2 — Modelos</w:t>
+              <w:t xml:space="preserve">H2: Modelos</w:t>
             </w:r>
           </w:p>
         </w:tc>
@@ -5443,7 +5443,7 @@
             </w:pPr>
             <w:r>
               <w:rPr/>
-              <w:t xml:space="preserve">H3 — Cierre</w:t>
+              <w:t xml:space="preserve">H3: Cierre</w:t>
             </w:r>
           </w:p>
         </w:tc>
@@ -5670,7 +5670,7 @@
       </w:pPr>
       <w:r>
         <w:rPr/>
-        <w:t xml:space="preserve">12. Suscripción VIA-HABITA — desde el Mes 6</w:t>
+        <w:t xml:space="preserve">12. Suscripción VIA-HABITA, desde el Mes 6</w:t>
       </w:r>
     </w:p>
     <w:p>
@@ -5842,7 +5842,7 @@
             </w:pPr>
             <w:r>
               <w:rPr/>
-              <w:t xml:space="preserve"> — internos, externos, consultores, subcontratistas</w:t>
+              <w:t xml:space="preserve">: internos, externos, consultores, subcontratistas</w:t>
             </w:r>
           </w:p>
         </w:tc>
@@ -6035,7 +6035,7 @@
       </w:pPr>
       <w:r>
         <w:rPr/>
-        <w:t xml:space="preserve">13. Comparativo — tres escenarios</w:t>
+        <w:t xml:space="preserve">13. Comparativo: tres escenarios</w:t>
       </w:r>
     </w:p>
     <w:p>
@@ -6064,7 +6064,7 @@
       </w:pPr>
       <w:r>
         <w:rPr/>
-        <w:t xml:space="preserve">13.1 Hoy — 10 usuarios</w:t>
+        <w:t xml:space="preserve">13.1 Hoy: 10 usuarios</w:t>
       </w:r>
     </w:p>
     <w:tbl>
@@ -6410,7 +6410,7 @@
       </w:pPr>
       <w:r>
         <w:rPr/>
-        <w:t xml:space="preserve">El trazador — el último eslabón — no recibe acceso. Cuando el modelo cambia, no se entera.</w:t>
+        <w:t xml:space="preserve">El trazador, el último eslabón, no recibe acceso. Cuando el modelo cambia, no se entera.</w:t>
       </w:r>
     </w:p>
     <w:p>
@@ -6445,7 +6445,7 @@
       </w:pPr>
       <w:r>
         <w:rPr/>
-        <w:t xml:space="preserve">Mantener 10 usuarios significa mantener el modelo actual con una herramienta diferente — el problema de alcance no se resuelve cambiando de proveedor sin cambiar el número de personas con acceso.</w:t>
+        <w:t xml:space="preserve">Mantener 10 usuarios significa mantener el modelo actual con una herramienta diferente. El problema de alcance no se resuelve cambiando de proveedor sin cambiar el número de personas con acceso.</w:t>
       </w:r>
     </w:p>
     <w:p>
@@ -6455,7 +6455,7 @@
       </w:pPr>
       <w:r>
         <w:rPr/>
-        <w:t xml:space="preserve">13.3 Real — 100 usuarios</w:t>
+        <w:t xml:space="preserve">13.3 Real: 100 usuarios</w:t>
       </w:r>
     </w:p>
     <w:p>
@@ -7113,7 +7113,7 @@
       </w:r>
       <w:r>
         <w:rPr/>
-        <w:t xml:space="preserve"> (~$128,000 / año de diferencia, ≈ CLP $120 millones). Con usuarios ilimitados, todo el equipo — incluido el trazador — recibe el modelo BIM directamente.</w:t>
+        <w:t xml:space="preserve"> (~$128,000 / año de diferencia, ≈ CLP $120 millones). Con usuarios ilimitados, todo el equipo, incluido el trazador, recibe el modelo BIM directamente.</w:t>
       </w:r>
     </w:p>
     <w:p>
@@ -7123,7 +7123,7 @@
       </w:pPr>
       <w:r>
         <w:rPr/>
-        <w:t xml:space="preserve">13.4 Otras plataformas — referencia a 50 usuarios, 6 proyectos</w:t>
+        <w:t xml:space="preserve">13.4 Otras plataformas: referencia a 50 usuarios, 6 proyectos</w:t>
       </w:r>
     </w:p>
     <w:tbl>
@@ -7926,7 +7926,7 @@
       </w:pPr>
       <w:r>
         <w:rPr/>
-        <w:t xml:space="preserve">Esto no es alcance contratado de Fase 1 — es la dirección que justifica construir la base bien.</w:t>
+        <w:t xml:space="preserve">Esto no es alcance contratado de Fase 1. Es la dirección que justifica construir la base bien.</w:t>
       </w:r>
     </w:p>
     <w:tbl>
@@ -8190,7 +8190,7 @@
       </w:r>
       <w:r>
         <w:rPr/>
-        <w:t xml:space="preserve"> todos los planos de construcción, todos los planos de cliente — una sola fuente de verdad a lo largo del ciclo de vida del proyecto.</w:t>
+        <w:t xml:space="preserve"> todos los planos de construcción, todos los planos de cliente. Una sola fuente de verdad a lo largo del ciclo de vida del proyecto.</w:t>
       </w:r>
     </w:p>
     <w:p>

</xml_diff>